<commit_message>
Nativewind added and dependencies installed
</commit_message>
<xml_diff>
--- a/Feature prototype.docx
+++ b/Feature prototype.docx
@@ -499,6 +499,459 @@
         </w:rPr>
         <w:lastRenderedPageBreak/>
         <w:t>Does the work demonstrate innovation and excellence beyond the above?</w:t>
+      </w:r>
+    </w:p>
+    <w:p>
+      <w:pPr>
+        <w:rPr>
+          <w:lang w:val="en-AT"/>
+        </w:rPr>
+      </w:pPr>
+    </w:p>
+    <w:p>
+      <w:pPr>
+        <w:rPr>
+          <w:lang w:val="en-AT"/>
+        </w:rPr>
+      </w:pPr>
+    </w:p>
+    <w:p>
+      <w:pPr>
+        <w:rPr>
+          <w:b/>
+          <w:bCs/>
+          <w:lang w:val="en-AT"/>
+        </w:rPr>
+      </w:pPr>
+      <w:r>
+        <w:rPr>
+          <w:b/>
+          <w:bCs/>
+          <w:lang w:val="en-AT"/>
+        </w:rPr>
+        <w:t>3. The prototype is about reducing uncertainty</w:t>
+      </w:r>
+    </w:p>
+    <w:p>
+      <w:pPr>
+        <w:rPr>
+          <w:lang w:val="en-AT"/>
+        </w:rPr>
+      </w:pPr>
+      <w:r>
+        <w:rPr>
+          <w:lang w:val="en-AT"/>
+        </w:rPr>
+        <w:t>The prototype helps answer questions like:</w:t>
+      </w:r>
+    </w:p>
+    <w:p>
+      <w:pPr>
+        <w:numPr>
+          <w:ilvl w:val="0"/>
+          <w:numId w:val="3"/>
+        </w:numPr>
+        <w:rPr>
+          <w:lang w:val="en-AT"/>
+        </w:rPr>
+      </w:pPr>
+      <w:r>
+        <w:rPr>
+          <w:lang w:val="en-AT"/>
+        </w:rPr>
+        <w:t xml:space="preserve">Have I chosen the right technical approach? </w:t>
+      </w:r>
+    </w:p>
+    <w:p>
+      <w:pPr>
+        <w:numPr>
+          <w:ilvl w:val="0"/>
+          <w:numId w:val="3"/>
+        </w:numPr>
+        <w:rPr>
+          <w:lang w:val="en-AT"/>
+        </w:rPr>
+      </w:pPr>
+      <w:r>
+        <w:rPr>
+          <w:lang w:val="en-AT"/>
+        </w:rPr>
+        <w:t xml:space="preserve">Do I understand the technique I need to use? </w:t>
+      </w:r>
+    </w:p>
+    <w:p>
+      <w:pPr>
+        <w:numPr>
+          <w:ilvl w:val="0"/>
+          <w:numId w:val="3"/>
+        </w:numPr>
+        <w:rPr>
+          <w:lang w:val="en-AT"/>
+        </w:rPr>
+      </w:pPr>
+      <w:r>
+        <w:rPr>
+          <w:lang w:val="en-AT"/>
+        </w:rPr>
+        <w:t xml:space="preserve">Can the core functionality </w:t>
+      </w:r>
+      <w:proofErr w:type="gramStart"/>
+      <w:r>
+        <w:rPr>
+          <w:lang w:val="en-AT"/>
+        </w:rPr>
+        <w:t>actually work</w:t>
+      </w:r>
+      <w:proofErr w:type="gramEnd"/>
+      <w:r>
+        <w:rPr>
+          <w:lang w:val="en-AT"/>
+        </w:rPr>
+        <w:t xml:space="preserve">? </w:t>
+      </w:r>
+    </w:p>
+    <w:p>
+      <w:pPr>
+        <w:numPr>
+          <w:ilvl w:val="0"/>
+          <w:numId w:val="3"/>
+        </w:numPr>
+        <w:rPr>
+          <w:lang w:val="en-AT"/>
+        </w:rPr>
+      </w:pPr>
+      <w:r>
+        <w:rPr>
+          <w:lang w:val="en-AT"/>
+        </w:rPr>
+        <w:t xml:space="preserve">Does this feature create problems for the rest of the design? </w:t>
+      </w:r>
+    </w:p>
+    <w:p>
+      <w:pPr>
+        <w:rPr>
+          <w:lang w:val="en-AT"/>
+        </w:rPr>
+      </w:pPr>
+      <w:r>
+        <w:rPr>
+          <w:lang w:val="en-AT"/>
+        </w:rPr>
+        <w:t xml:space="preserve">This is still </w:t>
+      </w:r>
+      <w:proofErr w:type="gramStart"/>
+      <w:r>
+        <w:rPr>
+          <w:lang w:val="en-AT"/>
+        </w:rPr>
+        <w:t>design</w:t>
+      </w:r>
+      <w:proofErr w:type="gramEnd"/>
+      <w:r>
+        <w:rPr>
+          <w:lang w:val="en-AT"/>
+        </w:rPr>
+        <w:t xml:space="preserve"> work, not full implementation. The aim is to prove that a key part of the project is feasible.</w:t>
+      </w:r>
+    </w:p>
+    <w:p>
+      <w:pPr>
+        <w:rPr>
+          <w:b/>
+          <w:bCs/>
+          <w:lang w:val="en-AT"/>
+        </w:rPr>
+      </w:pPr>
+      <w:r>
+        <w:rPr>
+          <w:b/>
+          <w:bCs/>
+          <w:lang w:val="en-AT"/>
+        </w:rPr>
+        <w:t>6. The prototype will be judged on technical quality, not visual polish</w:t>
+      </w:r>
+    </w:p>
+    <w:p>
+      <w:pPr>
+        <w:rPr>
+          <w:lang w:val="en-AT"/>
+        </w:rPr>
+      </w:pPr>
+      <w:r>
+        <w:rPr>
+          <w:lang w:val="en-AT"/>
+        </w:rPr>
+        <w:t>At this stage, appearance is not the main issue. The prototype does not need to look beautiful.</w:t>
+      </w:r>
+    </w:p>
+    <w:p>
+      <w:pPr>
+        <w:rPr>
+          <w:lang w:val="en-AT"/>
+        </w:rPr>
+      </w:pPr>
+      <w:r>
+        <w:rPr>
+          <w:lang w:val="en-AT"/>
+        </w:rPr>
+        <w:t>The important questions are:</w:t>
+      </w:r>
+    </w:p>
+    <w:p>
+      <w:pPr>
+        <w:numPr>
+          <w:ilvl w:val="0"/>
+          <w:numId w:val="4"/>
+        </w:numPr>
+        <w:rPr>
+          <w:lang w:val="en-AT"/>
+        </w:rPr>
+      </w:pPr>
+      <w:r>
+        <w:rPr>
+          <w:lang w:val="en-AT"/>
+        </w:rPr>
+        <w:t xml:space="preserve">Does it work well? </w:t>
+      </w:r>
+    </w:p>
+    <w:p>
+      <w:pPr>
+        <w:numPr>
+          <w:ilvl w:val="0"/>
+          <w:numId w:val="4"/>
+        </w:numPr>
+        <w:rPr>
+          <w:lang w:val="en-AT"/>
+        </w:rPr>
+      </w:pPr>
+      <w:r>
+        <w:rPr>
+          <w:lang w:val="en-AT"/>
+        </w:rPr>
+        <w:t xml:space="preserve">Is it technically strong? </w:t>
+      </w:r>
+    </w:p>
+    <w:p>
+      <w:pPr>
+        <w:numPr>
+          <w:ilvl w:val="0"/>
+          <w:numId w:val="4"/>
+        </w:numPr>
+        <w:rPr>
+          <w:lang w:val="en-AT"/>
+        </w:rPr>
+      </w:pPr>
+      <w:r>
+        <w:rPr>
+          <w:lang w:val="en-AT"/>
+        </w:rPr>
+        <w:t xml:space="preserve">Is it challenging or impressive? </w:t>
+      </w:r>
+    </w:p>
+    <w:p>
+      <w:pPr>
+        <w:numPr>
+          <w:ilvl w:val="0"/>
+          <w:numId w:val="4"/>
+        </w:numPr>
+        <w:rPr>
+          <w:lang w:val="en-AT"/>
+        </w:rPr>
+      </w:pPr>
+      <w:r>
+        <w:rPr>
+          <w:lang w:val="en-AT"/>
+        </w:rPr>
+        <w:t xml:space="preserve">Does it use suitable techniques? </w:t>
+      </w:r>
+    </w:p>
+    <w:p>
+      <w:pPr>
+        <w:numPr>
+          <w:ilvl w:val="0"/>
+          <w:numId w:val="4"/>
+        </w:numPr>
+        <w:rPr>
+          <w:lang w:val="en-AT"/>
+        </w:rPr>
+      </w:pPr>
+      <w:r>
+        <w:rPr>
+          <w:lang w:val="en-AT"/>
+        </w:rPr>
+        <w:t xml:space="preserve">Does it go beyond basic course material where appropriate? </w:t>
+      </w:r>
+    </w:p>
+    <w:p>
+      <w:pPr>
+        <w:rPr>
+          <w:lang w:val="en-AT"/>
+        </w:rPr>
+      </w:pPr>
+      <w:r>
+        <w:rPr>
+          <w:lang w:val="en-AT"/>
+        </w:rPr>
+        <w:t>A project can be valuable even if it is technically simple, but the lecturer also encourages technically ambitious or novel work where relevant.</w:t>
+      </w:r>
+    </w:p>
+    <w:p>
+      <w:pPr>
+        <w:rPr>
+          <w:b/>
+          <w:bCs/>
+          <w:lang w:val="en-AT"/>
+        </w:rPr>
+      </w:pPr>
+      <w:r>
+        <w:rPr>
+          <w:b/>
+          <w:bCs/>
+          <w:lang w:val="en-AT"/>
+        </w:rPr>
+        <w:t>7. Evaluation is important even at prototype stage</w:t>
+      </w:r>
+    </w:p>
+    <w:p>
+      <w:pPr>
+        <w:rPr>
+          <w:lang w:val="en-AT"/>
+        </w:rPr>
+      </w:pPr>
+      <w:r>
+        <w:rPr>
+          <w:lang w:val="en-AT"/>
+        </w:rPr>
+        <w:t>You should evaluate how well the prototype works. This does not necessarily mean full user testing yet.</w:t>
+      </w:r>
+    </w:p>
+    <w:p>
+      <w:pPr>
+        <w:rPr>
+          <w:lang w:val="en-AT"/>
+        </w:rPr>
+      </w:pPr>
+      <w:r>
+        <w:rPr>
+          <w:lang w:val="en-AT"/>
+        </w:rPr>
+        <w:t>Instead, you should explain:</w:t>
+      </w:r>
+    </w:p>
+    <w:p>
+      <w:pPr>
+        <w:numPr>
+          <w:ilvl w:val="0"/>
+          <w:numId w:val="5"/>
+        </w:numPr>
+        <w:rPr>
+          <w:lang w:val="en-AT"/>
+        </w:rPr>
+      </w:pPr>
+      <w:r>
+        <w:rPr>
+          <w:lang w:val="en-AT"/>
+        </w:rPr>
+        <w:t xml:space="preserve">what worked </w:t>
+      </w:r>
+    </w:p>
+    <w:p>
+      <w:pPr>
+        <w:numPr>
+          <w:ilvl w:val="0"/>
+          <w:numId w:val="5"/>
+        </w:numPr>
+        <w:rPr>
+          <w:lang w:val="en-AT"/>
+        </w:rPr>
+      </w:pPr>
+      <w:r>
+        <w:rPr>
+          <w:lang w:val="en-AT"/>
+        </w:rPr>
+        <w:t xml:space="preserve">what did not work </w:t>
+      </w:r>
+    </w:p>
+    <w:p>
+      <w:pPr>
+        <w:numPr>
+          <w:ilvl w:val="0"/>
+          <w:numId w:val="5"/>
+        </w:numPr>
+        <w:rPr>
+          <w:lang w:val="en-AT"/>
+        </w:rPr>
+      </w:pPr>
+      <w:r>
+        <w:rPr>
+          <w:lang w:val="en-AT"/>
+        </w:rPr>
+        <w:t xml:space="preserve">how reliable it was </w:t>
+      </w:r>
+    </w:p>
+    <w:p>
+      <w:pPr>
+        <w:numPr>
+          <w:ilvl w:val="0"/>
+          <w:numId w:val="5"/>
+        </w:numPr>
+        <w:rPr>
+          <w:lang w:val="en-AT"/>
+        </w:rPr>
+      </w:pPr>
+      <w:r>
+        <w:rPr>
+          <w:lang w:val="en-AT"/>
+        </w:rPr>
+        <w:t xml:space="preserve">what limitations were found </w:t>
+      </w:r>
+    </w:p>
+    <w:p>
+      <w:pPr>
+        <w:numPr>
+          <w:ilvl w:val="0"/>
+          <w:numId w:val="5"/>
+        </w:numPr>
+        <w:rPr>
+          <w:lang w:val="en-AT"/>
+        </w:rPr>
+      </w:pPr>
+      <w:r>
+        <w:rPr>
+          <w:lang w:val="en-AT"/>
+        </w:rPr>
+        <w:t xml:space="preserve">what improvements are needed </w:t>
+      </w:r>
+    </w:p>
+    <w:p>
+      <w:pPr>
+        <w:numPr>
+          <w:ilvl w:val="0"/>
+          <w:numId w:val="5"/>
+        </w:numPr>
+        <w:rPr>
+          <w:lang w:val="en-AT"/>
+        </w:rPr>
+      </w:pPr>
+      <w:r>
+        <w:rPr>
+          <w:lang w:val="en-AT"/>
+        </w:rPr>
+        <w:t xml:space="preserve">how the results affect the rest of the project </w:t>
+      </w:r>
+    </w:p>
+    <w:p>
+      <w:pPr>
+        <w:rPr>
+          <w:lang w:val="en-AT"/>
+        </w:rPr>
+      </w:pPr>
+      <w:r>
+        <w:rPr>
+          <w:lang w:val="en-AT"/>
+        </w:rPr>
+        <w:lastRenderedPageBreak/>
+        <w:t>For example, if a feature is only 80% reliable, you need to decide whether to improve that feature or adjust the rest of the system design to handle that weakness.</w:t>
       </w:r>
     </w:p>
     <w:p>
@@ -521,6 +974,453 @@
 <file path=word/numbering.xml><?xml version="1.0" encoding="utf-8"?>
 <w:numbering xmlns:wpc="http://schemas.microsoft.com/office/word/2010/wordprocessingCanvas" xmlns:cx="http://schemas.microsoft.com/office/drawing/2014/chartex" xmlns:cx1="http://schemas.microsoft.com/office/drawing/2015/9/8/chartex" xmlns:cx2="http://schemas.microsoft.com/office/drawing/2015/10/21/chartex" xmlns:cx3="http://schemas.microsoft.com/office/drawing/2016/5/9/chartex" xmlns:cx4="http://schemas.microsoft.com/office/drawing/2016/5/10/chartex" xmlns:cx5="http://schemas.microsoft.com/office/drawing/2016/5/11/chartex" xmlns:cx6="http://schemas.microsoft.com/office/drawing/2016/5/12/chartex" xmlns:cx7="http://schemas.microsoft.com/office/drawing/2016/5/13/chartex" xmlns:cx8="http://schemas.microsoft.com/office/drawing/2016/5/14/chartex" xmlns:mc="http://schemas.openxmlformats.org/markup-compatibility/2006" xmlns:aink="http://schemas.microsoft.com/office/drawing/2016/ink" xmlns:am3d="http://schemas.microsoft.com/office/drawing/2017/model3d" xmlns:o="urn:schemas-microsoft-com:office:office" xmlns:oel="http://schemas.microsoft.com/office/2019/extlst" xmlns:r="http://schemas.openxmlformats.org/officeDocument/2006/relationships" xmlns:m="http://schemas.openxmlformats.org/officeDocument/2006/math" xmlns:v="urn:schemas-microsoft-com:vml" xmlns:wp14="http://schemas.microsoft.com/office/word/2010/wordprocessingDrawing" xmlns:wp="http://schemas.openxmlformats.org/drawingml/2006/wordprocessingDrawing" xmlns:w10="urn:schemas-microsoft-com:office:word" xmlns:w="http://schemas.openxmlformats.org/wordprocessingml/2006/main" xmlns:w14="http://schemas.microsoft.com/office/word/2010/wordml" xmlns:w15="http://schemas.microsoft.com/office/word/2012/wordml" xmlns:w16cex="http://schemas.microsoft.com/office/word/2018/wordml/cex" xmlns:w16cid="http://schemas.microsoft.com/office/word/2016/wordml/cid" xmlns:w16="http://schemas.microsoft.com/office/word/2018/wordml" xmlns:w16du="http://schemas.microsoft.com/office/word/2023/wordml/word16du" xmlns:w16sdtdh="http://schemas.microsoft.com/office/word/2020/wordml/sdtdatahash" xmlns:w16sdtfl="http://schemas.microsoft.com/office/word/2024/wordml/sdtformatlock" xmlns:w16se="http://schemas.microsoft.com/office/word/2015/wordml/symex" xmlns:wpg="http://schemas.microsoft.com/office/word/2010/wordprocessingGroup" xmlns:wpi="http://schemas.microsoft.com/office/word/2010/wordprocessingInk" xmlns:wne="http://schemas.microsoft.com/office/word/2006/wordml" xmlns:wps="http://schemas.microsoft.com/office/word/2010/wordprocessingShape" mc:Ignorable="w14 w15 w16se w16cid w16 w16cex w16sdtdh w16sdtfl w16du wp14">
   <w:abstractNum w:abstractNumId="0" w15:restartNumberingAfterBreak="0">
+    <w:nsid w:val="0C176ECF"/>
+    <w:multiLevelType w:val="multilevel"/>
+    <w:tmpl w:val="B3321D8E"/>
+    <w:lvl w:ilvl="0">
+      <w:start w:val="1"/>
+      <w:numFmt w:val="bullet"/>
+      <w:lvlText w:val=""/>
+      <w:lvlJc w:val="left"/>
+      <w:pPr>
+        <w:tabs>
+          <w:tab w:val="num" w:pos="720"/>
+        </w:tabs>
+        <w:ind w:left="720" w:hanging="360"/>
+      </w:pPr>
+      <w:rPr>
+        <w:rFonts w:ascii="Symbol" w:hAnsi="Symbol" w:hint="default"/>
+        <w:sz w:val="20"/>
+      </w:rPr>
+    </w:lvl>
+    <w:lvl w:ilvl="1" w:tentative="1">
+      <w:start w:val="1"/>
+      <w:numFmt w:val="bullet"/>
+      <w:lvlText w:val="o"/>
+      <w:lvlJc w:val="left"/>
+      <w:pPr>
+        <w:tabs>
+          <w:tab w:val="num" w:pos="1440"/>
+        </w:tabs>
+        <w:ind w:left="1440" w:hanging="360"/>
+      </w:pPr>
+      <w:rPr>
+        <w:rFonts w:ascii="Courier New" w:hAnsi="Courier New" w:hint="default"/>
+        <w:sz w:val="20"/>
+      </w:rPr>
+    </w:lvl>
+    <w:lvl w:ilvl="2" w:tentative="1">
+      <w:start w:val="1"/>
+      <w:numFmt w:val="bullet"/>
+      <w:lvlText w:val=""/>
+      <w:lvlJc w:val="left"/>
+      <w:pPr>
+        <w:tabs>
+          <w:tab w:val="num" w:pos="2160"/>
+        </w:tabs>
+        <w:ind w:left="2160" w:hanging="360"/>
+      </w:pPr>
+      <w:rPr>
+        <w:rFonts w:ascii="Wingdings" w:hAnsi="Wingdings" w:hint="default"/>
+        <w:sz w:val="20"/>
+      </w:rPr>
+    </w:lvl>
+    <w:lvl w:ilvl="3" w:tentative="1">
+      <w:start w:val="1"/>
+      <w:numFmt w:val="bullet"/>
+      <w:lvlText w:val=""/>
+      <w:lvlJc w:val="left"/>
+      <w:pPr>
+        <w:tabs>
+          <w:tab w:val="num" w:pos="2880"/>
+        </w:tabs>
+        <w:ind w:left="2880" w:hanging="360"/>
+      </w:pPr>
+      <w:rPr>
+        <w:rFonts w:ascii="Wingdings" w:hAnsi="Wingdings" w:hint="default"/>
+        <w:sz w:val="20"/>
+      </w:rPr>
+    </w:lvl>
+    <w:lvl w:ilvl="4" w:tentative="1">
+      <w:start w:val="1"/>
+      <w:numFmt w:val="bullet"/>
+      <w:lvlText w:val=""/>
+      <w:lvlJc w:val="left"/>
+      <w:pPr>
+        <w:tabs>
+          <w:tab w:val="num" w:pos="3600"/>
+        </w:tabs>
+        <w:ind w:left="3600" w:hanging="360"/>
+      </w:pPr>
+      <w:rPr>
+        <w:rFonts w:ascii="Wingdings" w:hAnsi="Wingdings" w:hint="default"/>
+        <w:sz w:val="20"/>
+      </w:rPr>
+    </w:lvl>
+    <w:lvl w:ilvl="5" w:tentative="1">
+      <w:start w:val="1"/>
+      <w:numFmt w:val="bullet"/>
+      <w:lvlText w:val=""/>
+      <w:lvlJc w:val="left"/>
+      <w:pPr>
+        <w:tabs>
+          <w:tab w:val="num" w:pos="4320"/>
+        </w:tabs>
+        <w:ind w:left="4320" w:hanging="360"/>
+      </w:pPr>
+      <w:rPr>
+        <w:rFonts w:ascii="Wingdings" w:hAnsi="Wingdings" w:hint="default"/>
+        <w:sz w:val="20"/>
+      </w:rPr>
+    </w:lvl>
+    <w:lvl w:ilvl="6" w:tentative="1">
+      <w:start w:val="1"/>
+      <w:numFmt w:val="bullet"/>
+      <w:lvlText w:val=""/>
+      <w:lvlJc w:val="left"/>
+      <w:pPr>
+        <w:tabs>
+          <w:tab w:val="num" w:pos="5040"/>
+        </w:tabs>
+        <w:ind w:left="5040" w:hanging="360"/>
+      </w:pPr>
+      <w:rPr>
+        <w:rFonts w:ascii="Wingdings" w:hAnsi="Wingdings" w:hint="default"/>
+        <w:sz w:val="20"/>
+      </w:rPr>
+    </w:lvl>
+    <w:lvl w:ilvl="7" w:tentative="1">
+      <w:start w:val="1"/>
+      <w:numFmt w:val="bullet"/>
+      <w:lvlText w:val=""/>
+      <w:lvlJc w:val="left"/>
+      <w:pPr>
+        <w:tabs>
+          <w:tab w:val="num" w:pos="5760"/>
+        </w:tabs>
+        <w:ind w:left="5760" w:hanging="360"/>
+      </w:pPr>
+      <w:rPr>
+        <w:rFonts w:ascii="Wingdings" w:hAnsi="Wingdings" w:hint="default"/>
+        <w:sz w:val="20"/>
+      </w:rPr>
+    </w:lvl>
+    <w:lvl w:ilvl="8" w:tentative="1">
+      <w:start w:val="1"/>
+      <w:numFmt w:val="bullet"/>
+      <w:lvlText w:val=""/>
+      <w:lvlJc w:val="left"/>
+      <w:pPr>
+        <w:tabs>
+          <w:tab w:val="num" w:pos="6480"/>
+        </w:tabs>
+        <w:ind w:left="6480" w:hanging="360"/>
+      </w:pPr>
+      <w:rPr>
+        <w:rFonts w:ascii="Wingdings" w:hAnsi="Wingdings" w:hint="default"/>
+        <w:sz w:val="20"/>
+      </w:rPr>
+    </w:lvl>
+  </w:abstractNum>
+  <w:abstractNum w:abstractNumId="1" w15:restartNumberingAfterBreak="0">
+    <w:nsid w:val="2E094AC1"/>
+    <w:multiLevelType w:val="multilevel"/>
+    <w:tmpl w:val="1A46634E"/>
+    <w:lvl w:ilvl="0">
+      <w:start w:val="1"/>
+      <w:numFmt w:val="bullet"/>
+      <w:lvlText w:val=""/>
+      <w:lvlJc w:val="left"/>
+      <w:pPr>
+        <w:tabs>
+          <w:tab w:val="num" w:pos="720"/>
+        </w:tabs>
+        <w:ind w:left="720" w:hanging="360"/>
+      </w:pPr>
+      <w:rPr>
+        <w:rFonts w:ascii="Symbol" w:hAnsi="Symbol" w:hint="default"/>
+        <w:sz w:val="20"/>
+      </w:rPr>
+    </w:lvl>
+    <w:lvl w:ilvl="1" w:tentative="1">
+      <w:start w:val="1"/>
+      <w:numFmt w:val="bullet"/>
+      <w:lvlText w:val="o"/>
+      <w:lvlJc w:val="left"/>
+      <w:pPr>
+        <w:tabs>
+          <w:tab w:val="num" w:pos="1440"/>
+        </w:tabs>
+        <w:ind w:left="1440" w:hanging="360"/>
+      </w:pPr>
+      <w:rPr>
+        <w:rFonts w:ascii="Courier New" w:hAnsi="Courier New" w:hint="default"/>
+        <w:sz w:val="20"/>
+      </w:rPr>
+    </w:lvl>
+    <w:lvl w:ilvl="2" w:tentative="1">
+      <w:start w:val="1"/>
+      <w:numFmt w:val="bullet"/>
+      <w:lvlText w:val=""/>
+      <w:lvlJc w:val="left"/>
+      <w:pPr>
+        <w:tabs>
+          <w:tab w:val="num" w:pos="2160"/>
+        </w:tabs>
+        <w:ind w:left="2160" w:hanging="360"/>
+      </w:pPr>
+      <w:rPr>
+        <w:rFonts w:ascii="Wingdings" w:hAnsi="Wingdings" w:hint="default"/>
+        <w:sz w:val="20"/>
+      </w:rPr>
+    </w:lvl>
+    <w:lvl w:ilvl="3" w:tentative="1">
+      <w:start w:val="1"/>
+      <w:numFmt w:val="bullet"/>
+      <w:lvlText w:val=""/>
+      <w:lvlJc w:val="left"/>
+      <w:pPr>
+        <w:tabs>
+          <w:tab w:val="num" w:pos="2880"/>
+        </w:tabs>
+        <w:ind w:left="2880" w:hanging="360"/>
+      </w:pPr>
+      <w:rPr>
+        <w:rFonts w:ascii="Wingdings" w:hAnsi="Wingdings" w:hint="default"/>
+        <w:sz w:val="20"/>
+      </w:rPr>
+    </w:lvl>
+    <w:lvl w:ilvl="4" w:tentative="1">
+      <w:start w:val="1"/>
+      <w:numFmt w:val="bullet"/>
+      <w:lvlText w:val=""/>
+      <w:lvlJc w:val="left"/>
+      <w:pPr>
+        <w:tabs>
+          <w:tab w:val="num" w:pos="3600"/>
+        </w:tabs>
+        <w:ind w:left="3600" w:hanging="360"/>
+      </w:pPr>
+      <w:rPr>
+        <w:rFonts w:ascii="Wingdings" w:hAnsi="Wingdings" w:hint="default"/>
+        <w:sz w:val="20"/>
+      </w:rPr>
+    </w:lvl>
+    <w:lvl w:ilvl="5" w:tentative="1">
+      <w:start w:val="1"/>
+      <w:numFmt w:val="bullet"/>
+      <w:lvlText w:val=""/>
+      <w:lvlJc w:val="left"/>
+      <w:pPr>
+        <w:tabs>
+          <w:tab w:val="num" w:pos="4320"/>
+        </w:tabs>
+        <w:ind w:left="4320" w:hanging="360"/>
+      </w:pPr>
+      <w:rPr>
+        <w:rFonts w:ascii="Wingdings" w:hAnsi="Wingdings" w:hint="default"/>
+        <w:sz w:val="20"/>
+      </w:rPr>
+    </w:lvl>
+    <w:lvl w:ilvl="6" w:tentative="1">
+      <w:start w:val="1"/>
+      <w:numFmt w:val="bullet"/>
+      <w:lvlText w:val=""/>
+      <w:lvlJc w:val="left"/>
+      <w:pPr>
+        <w:tabs>
+          <w:tab w:val="num" w:pos="5040"/>
+        </w:tabs>
+        <w:ind w:left="5040" w:hanging="360"/>
+      </w:pPr>
+      <w:rPr>
+        <w:rFonts w:ascii="Wingdings" w:hAnsi="Wingdings" w:hint="default"/>
+        <w:sz w:val="20"/>
+      </w:rPr>
+    </w:lvl>
+    <w:lvl w:ilvl="7" w:tentative="1">
+      <w:start w:val="1"/>
+      <w:numFmt w:val="bullet"/>
+      <w:lvlText w:val=""/>
+      <w:lvlJc w:val="left"/>
+      <w:pPr>
+        <w:tabs>
+          <w:tab w:val="num" w:pos="5760"/>
+        </w:tabs>
+        <w:ind w:left="5760" w:hanging="360"/>
+      </w:pPr>
+      <w:rPr>
+        <w:rFonts w:ascii="Wingdings" w:hAnsi="Wingdings" w:hint="default"/>
+        <w:sz w:val="20"/>
+      </w:rPr>
+    </w:lvl>
+    <w:lvl w:ilvl="8" w:tentative="1">
+      <w:start w:val="1"/>
+      <w:numFmt w:val="bullet"/>
+      <w:lvlText w:val=""/>
+      <w:lvlJc w:val="left"/>
+      <w:pPr>
+        <w:tabs>
+          <w:tab w:val="num" w:pos="6480"/>
+        </w:tabs>
+        <w:ind w:left="6480" w:hanging="360"/>
+      </w:pPr>
+      <w:rPr>
+        <w:rFonts w:ascii="Wingdings" w:hAnsi="Wingdings" w:hint="default"/>
+        <w:sz w:val="20"/>
+      </w:rPr>
+    </w:lvl>
+  </w:abstractNum>
+  <w:abstractNum w:abstractNumId="2" w15:restartNumberingAfterBreak="0">
+    <w:nsid w:val="2F3D76A7"/>
+    <w:multiLevelType w:val="multilevel"/>
+    <w:tmpl w:val="4E8CCBD6"/>
+    <w:lvl w:ilvl="0">
+      <w:start w:val="1"/>
+      <w:numFmt w:val="bullet"/>
+      <w:lvlText w:val=""/>
+      <w:lvlJc w:val="left"/>
+      <w:pPr>
+        <w:tabs>
+          <w:tab w:val="num" w:pos="720"/>
+        </w:tabs>
+        <w:ind w:left="720" w:hanging="360"/>
+      </w:pPr>
+      <w:rPr>
+        <w:rFonts w:ascii="Symbol" w:hAnsi="Symbol" w:hint="default"/>
+        <w:sz w:val="20"/>
+      </w:rPr>
+    </w:lvl>
+    <w:lvl w:ilvl="1" w:tentative="1">
+      <w:start w:val="1"/>
+      <w:numFmt w:val="bullet"/>
+      <w:lvlText w:val="o"/>
+      <w:lvlJc w:val="left"/>
+      <w:pPr>
+        <w:tabs>
+          <w:tab w:val="num" w:pos="1440"/>
+        </w:tabs>
+        <w:ind w:left="1440" w:hanging="360"/>
+      </w:pPr>
+      <w:rPr>
+        <w:rFonts w:ascii="Courier New" w:hAnsi="Courier New" w:hint="default"/>
+        <w:sz w:val="20"/>
+      </w:rPr>
+    </w:lvl>
+    <w:lvl w:ilvl="2" w:tentative="1">
+      <w:start w:val="1"/>
+      <w:numFmt w:val="bullet"/>
+      <w:lvlText w:val=""/>
+      <w:lvlJc w:val="left"/>
+      <w:pPr>
+        <w:tabs>
+          <w:tab w:val="num" w:pos="2160"/>
+        </w:tabs>
+        <w:ind w:left="2160" w:hanging="360"/>
+      </w:pPr>
+      <w:rPr>
+        <w:rFonts w:ascii="Wingdings" w:hAnsi="Wingdings" w:hint="default"/>
+        <w:sz w:val="20"/>
+      </w:rPr>
+    </w:lvl>
+    <w:lvl w:ilvl="3" w:tentative="1">
+      <w:start w:val="1"/>
+      <w:numFmt w:val="bullet"/>
+      <w:lvlText w:val=""/>
+      <w:lvlJc w:val="left"/>
+      <w:pPr>
+        <w:tabs>
+          <w:tab w:val="num" w:pos="2880"/>
+        </w:tabs>
+        <w:ind w:left="2880" w:hanging="360"/>
+      </w:pPr>
+      <w:rPr>
+        <w:rFonts w:ascii="Wingdings" w:hAnsi="Wingdings" w:hint="default"/>
+        <w:sz w:val="20"/>
+      </w:rPr>
+    </w:lvl>
+    <w:lvl w:ilvl="4" w:tentative="1">
+      <w:start w:val="1"/>
+      <w:numFmt w:val="bullet"/>
+      <w:lvlText w:val=""/>
+      <w:lvlJc w:val="left"/>
+      <w:pPr>
+        <w:tabs>
+          <w:tab w:val="num" w:pos="3600"/>
+        </w:tabs>
+        <w:ind w:left="3600" w:hanging="360"/>
+      </w:pPr>
+      <w:rPr>
+        <w:rFonts w:ascii="Wingdings" w:hAnsi="Wingdings" w:hint="default"/>
+        <w:sz w:val="20"/>
+      </w:rPr>
+    </w:lvl>
+    <w:lvl w:ilvl="5" w:tentative="1">
+      <w:start w:val="1"/>
+      <w:numFmt w:val="bullet"/>
+      <w:lvlText w:val=""/>
+      <w:lvlJc w:val="left"/>
+      <w:pPr>
+        <w:tabs>
+          <w:tab w:val="num" w:pos="4320"/>
+        </w:tabs>
+        <w:ind w:left="4320" w:hanging="360"/>
+      </w:pPr>
+      <w:rPr>
+        <w:rFonts w:ascii="Wingdings" w:hAnsi="Wingdings" w:hint="default"/>
+        <w:sz w:val="20"/>
+      </w:rPr>
+    </w:lvl>
+    <w:lvl w:ilvl="6" w:tentative="1">
+      <w:start w:val="1"/>
+      <w:numFmt w:val="bullet"/>
+      <w:lvlText w:val=""/>
+      <w:lvlJc w:val="left"/>
+      <w:pPr>
+        <w:tabs>
+          <w:tab w:val="num" w:pos="5040"/>
+        </w:tabs>
+        <w:ind w:left="5040" w:hanging="360"/>
+      </w:pPr>
+      <w:rPr>
+        <w:rFonts w:ascii="Wingdings" w:hAnsi="Wingdings" w:hint="default"/>
+        <w:sz w:val="20"/>
+      </w:rPr>
+    </w:lvl>
+    <w:lvl w:ilvl="7" w:tentative="1">
+      <w:start w:val="1"/>
+      <w:numFmt w:val="bullet"/>
+      <w:lvlText w:val=""/>
+      <w:lvlJc w:val="left"/>
+      <w:pPr>
+        <w:tabs>
+          <w:tab w:val="num" w:pos="5760"/>
+        </w:tabs>
+        <w:ind w:left="5760" w:hanging="360"/>
+      </w:pPr>
+      <w:rPr>
+        <w:rFonts w:ascii="Wingdings" w:hAnsi="Wingdings" w:hint="default"/>
+        <w:sz w:val="20"/>
+      </w:rPr>
+    </w:lvl>
+    <w:lvl w:ilvl="8" w:tentative="1">
+      <w:start w:val="1"/>
+      <w:numFmt w:val="bullet"/>
+      <w:lvlText w:val=""/>
+      <w:lvlJc w:val="left"/>
+      <w:pPr>
+        <w:tabs>
+          <w:tab w:val="num" w:pos="6480"/>
+        </w:tabs>
+        <w:ind w:left="6480" w:hanging="360"/>
+      </w:pPr>
+      <w:rPr>
+        <w:rFonts w:ascii="Wingdings" w:hAnsi="Wingdings" w:hint="default"/>
+        <w:sz w:val="20"/>
+      </w:rPr>
+    </w:lvl>
+  </w:abstractNum>
+  <w:abstractNum w:abstractNumId="3" w15:restartNumberingAfterBreak="0">
     <w:nsid w:val="34554BFF"/>
     <w:multiLevelType w:val="multilevel"/>
     <w:tmpl w:val="61A0C558"/>
@@ -633,7 +1533,7 @@
       </w:pPr>
     </w:lvl>
   </w:abstractNum>
-  <w:abstractNum w:abstractNumId="1" w15:restartNumberingAfterBreak="0">
+  <w:abstractNum w:abstractNumId="4" w15:restartNumberingAfterBreak="0">
     <w:nsid w:val="3C054CD7"/>
     <w:multiLevelType w:val="multilevel"/>
     <w:tmpl w:val="5518101C"/>
@@ -783,10 +1683,19 @@
     </w:lvl>
   </w:abstractNum>
   <w:num w:numId="1" w16cid:durableId="979769102">
+    <w:abstractNumId w:val="4"/>
+  </w:num>
+  <w:num w:numId="2" w16cid:durableId="999847639">
+    <w:abstractNumId w:val="3"/>
+  </w:num>
+  <w:num w:numId="3" w16cid:durableId="293953700">
     <w:abstractNumId w:val="1"/>
   </w:num>
-  <w:num w:numId="2" w16cid:durableId="999847639">
+  <w:num w:numId="4" w16cid:durableId="629823978">
     <w:abstractNumId w:val="0"/>
+  </w:num>
+  <w:num w:numId="5" w16cid:durableId="1109663047">
+    <w:abstractNumId w:val="2"/>
   </w:num>
 </w:numbering>
 </file>

</xml_diff>